<commit_message>
Add Family Information design fields and wire them through document generation.
Children, disinheritance toggles, and disinherited-heir selections now flow from the design sheet into draft payloads, estate generator data, clause libraries, and trust/will templates.

Co-authored-by: Cursor <cursoragent@cursor.com>
</commit_message>
<xml_diff>
--- a/tools/aubreylaw-docgeneration/templates/joint-trust.docx
+++ b/tools/aubreylaw-docgeneration/templates/joint-trust.docx
@@ -726,7 +726,7 @@
         <w:pStyle w:val="TextHeading2"/>
       </w:pPr>
       <w:r>
-        <w:t>{% if has_children %}Our children are {% for child in children %}{{ child.full_name | name }}{% if not loop.last %}, {% endif %}{% endfor %}.{% else %}We have no children living on the date of this trust.{% endif %}</w:t>
+        <w:t>{% if has_children %}Our children are {% for child in children %}{{ child.full_name | name }}{% if include_child_gender_markers and child.gender_display %} ({{ child.gender_display }}){% endif %}{% if not loop.last %}, {% endif %}{% endfor %}.{% else %}We have no children living on the date of this trust.{% endif %}</w:t>
       </w:r>
       <w:r/>
       <w:r/>
@@ -814,7 +814,7 @@
         <w:pStyle w:val="TextHeading2"/>
       </w:pPr>
       <w:r>
-        <w:t>{% if trust.disinherited %}We intentionally have not provided for {% for person in trust.disinherited %}{{ person.full_name | name }}{% if not loop.last %}, {% endif %}{% endfor %} as a beneficiary in this trust; therefore, for all purposes of this trust, each such person will be treated as having predeceased both of us.{% endif %}</w:t>
+        <w:t>{% if trust.disinherited %}We intentionally have not provided for {% for person in trust.disinherited %}{{ person.full_name | name }}{% if not loop.last %}, {% endif %}{% endfor %} as a beneficiary in this trust; therefore, for all purposes of this trust, each such person will be treated as having predeceased both of us{% if disinherit_issue %} without any surviving descendants{% endif %}.{% endif %}{% if family.additional_disinheritance_language %} {{ family.additional_disinheritance_language }}{% endif %}</w:t>
       </w:r>
       <w:r/>
       <w:r/>
@@ -828,7 +828,7 @@
         <w:pStyle w:val="TextHeading2"/>
       </w:pPr>
       <w:r>
-        <w:t>Except as otherwise provided in this trust, I, {{ client.full_name | name }}, am intentionally disinheriting, omitting, and not providing for any other person or persons who claim to be my descendants or heirs under any circumstances and without regard to the nature of any evidence which may indicate status as descendants or heirs.  I acknowledge and understand that, except as otherwise provided in this trust, I am generally disinheriting, omitting, and not providing for any person or persons that may qualify as a pretermitted or omitted heir, spouse, or child.</w:t>
+        <w:t>{% if include_general_disinheritance %}Except as otherwise provided in this trust, I, {{ client.full_name | name }}, am intentionally disinheriting, omitting, and not providing for any other person or persons who claim to be my descendants or heirs under any circumstances and without regard to the nature of any evidence which may indicate status as descendants or heirs.  I acknowledge and understand that, except as otherwise provided in this trust, I am generally disinheriting, omitting, and not providing for any person or persons that may qualify as a pretermitted or omitted heir, spouse, or child.{% endif %}</w:t>
       </w:r>
       <w:r/>
       <w:r/>
@@ -838,7 +838,7 @@
         <w:pStyle w:val="TextHeading2"/>
       </w:pPr>
       <w:r>
-        <w:t>Except as otherwise provided in this trust, I, {{ spouse.full_name | name }}, am intentionally disinheriting, omitting, and not providing for any other person or persons who claim to be my descendants or heirs under any circumstances and without regard to the nature of any evidence which may indicate status as descendants or heirs.  I acknowledge and understand that, except as otherwise provided in this trust, I am generally disinheriting, omitting, and not providing for any person or persons that may qualify as a pretermitted or omitted heir, spouse, or child.</w:t>
+        <w:t>{% if include_general_disinheritance %}Except as otherwise provided in this trust, I, {{ spouse.full_name | name }}, am intentionally disinheriting, omitting, and not providing for any other person or persons who claim to be my descendants or heirs under any circumstances and without regard to the nature of any evidence which may indicate status as descendants or heirs.  I acknowledge and understand that, except as otherwise provided in this trust, I am generally disinheriting, omitting, and not providing for any person or persons that may qualify as a pretermitted or omitted heir, spouse, or child.{% endif %}</w:t>
       </w:r>
       <w:r/>
       <w:r/>

</xml_diff>